<commit_message>
docs: Update GENS-2101 project documents, refine personal project markdown heading, and remove a temporary file.
</commit_message>
<xml_diff>
--- a/02_Resources/Academics/GENS-2101/Joel_Palk-Ricard_GENS2101_Project_Part1_FINAL.docx
+++ b/02_Resources/Academics/GENS-2101/Joel_Palk-Ricard_GENS2101_Project_Part1_FINAL.docx
@@ -50,7 +50,20 @@
         <w:rPr>
           <w:b/>
         </w:rPr>
-        <w:t>1. Selection of Resource: Atlantic Salmon (*Salmo salar*)</w:t>
+        <w:t xml:space="preserve">1. Selection of Resource: Atlantic Salmon (Species: </w:t>
+      </w:r>
+      <w:r>
+        <w:rPr>
+          <w:b/>
+          <w:i/>
+        </w:rPr>
+        <w:t>Salmo salar</w:t>
+      </w:r>
+      <w:r>
+        <w:rPr>
+          <w:b/>
+        </w:rPr>
+        <w:t>)</w:t>
       </w:r>
     </w:p>
     <w:p/>

</xml_diff>